<commit_message>
Completed Meeting Log 2
</commit_message>
<xml_diff>
--- a/Meeting Logs.docx
+++ b/Meeting Logs.docx
@@ -1190,6 +1190,720 @@
         </w:rPr>
         <w:t xml:space="preserve">. </w:t>
       </w:r>
+    </w:p>
+    <w:p>
+      <w:pPr>
+        <w:rPr>
+          <w:rFonts w:ascii="Times New Roman" w:eastAsia="Times New Roman" w:hAnsi="Times New Roman" w:cs="Times New Roman"/>
+          <w:color w:val="333333"/>
+          <w:kern w:val="0"/>
+          <w14:ligatures w14:val="none"/>
+        </w:rPr>
+      </w:pPr>
+      <w:r>
+        <w:rPr>
+          <w:color w:val="333333"/>
+        </w:rPr>
+        <w:br w:type="page"/>
+      </w:r>
+    </w:p>
+    <w:p>
+      <w:pPr>
+        <w:pStyle w:val="NormalWeb"/>
+        <w:spacing w:before="0" w:beforeAutospacing="0" w:after="0" w:afterAutospacing="0" w:line="360" w:lineRule="auto"/>
+        <w:rPr>
+          <w:color w:val="333333"/>
+        </w:rPr>
+      </w:pPr>
+      <w:r>
+        <w:rPr>
+          <w:rStyle w:val="Strong"/>
+          <w:rFonts w:eastAsiaTheme="majorEastAsia"/>
+          <w:color w:val="333333"/>
+        </w:rPr>
+        <w:lastRenderedPageBreak/>
+        <w:t>Date:</w:t>
+      </w:r>
+      <w:r>
+        <w:rPr>
+          <w:color w:val="333333"/>
+        </w:rPr>
+        <w:t xml:space="preserve"> February </w:t>
+      </w:r>
+      <w:r>
+        <w:rPr>
+          <w:color w:val="333333"/>
+        </w:rPr>
+        <w:t>27</w:t>
+      </w:r>
+      <w:r>
+        <w:rPr>
+          <w:color w:val="333333"/>
+        </w:rPr>
+        <w:t>, 202</w:t>
+      </w:r>
+      <w:r>
+        <w:rPr>
+          <w:color w:val="333333"/>
+        </w:rPr>
+        <w:t>6</w:t>
+      </w:r>
+      <w:r>
+        <w:rPr>
+          <w:color w:val="333333"/>
+        </w:rPr>
+        <w:br/>
+      </w:r>
+      <w:r>
+        <w:rPr>
+          <w:rStyle w:val="Strong"/>
+          <w:rFonts w:eastAsiaTheme="majorEastAsia"/>
+          <w:color w:val="333333"/>
+        </w:rPr>
+        <w:t>Time:</w:t>
+      </w:r>
+      <w:r>
+        <w:rPr>
+          <w:color w:val="333333"/>
+        </w:rPr>
+        <w:t> </w:t>
+      </w:r>
+      <w:r>
+        <w:rPr>
+          <w:color w:val="333333"/>
+        </w:rPr>
+        <w:t>5:00</w:t>
+      </w:r>
+      <w:r>
+        <w:rPr>
+          <w:color w:val="333333"/>
+        </w:rPr>
+        <w:t xml:space="preserve"> PM - </w:t>
+      </w:r>
+      <w:r>
+        <w:rPr>
+          <w:color w:val="333333"/>
+        </w:rPr>
+        <w:t>5</w:t>
+      </w:r>
+      <w:r>
+        <w:rPr>
+          <w:color w:val="333333"/>
+        </w:rPr>
+        <w:t>:</w:t>
+      </w:r>
+      <w:r>
+        <w:rPr>
+          <w:color w:val="333333"/>
+        </w:rPr>
+        <w:t>3</w:t>
+      </w:r>
+      <w:r>
+        <w:rPr>
+          <w:color w:val="333333"/>
+        </w:rPr>
+        <w:t>0 PM</w:t>
+      </w:r>
+      <w:r>
+        <w:rPr>
+          <w:color w:val="333333"/>
+        </w:rPr>
+        <w:br/>
+      </w:r>
+      <w:r>
+        <w:rPr>
+          <w:rStyle w:val="Strong"/>
+          <w:rFonts w:eastAsiaTheme="majorEastAsia"/>
+          <w:color w:val="333333"/>
+        </w:rPr>
+        <w:t>Location:</w:t>
+      </w:r>
+      <w:r>
+        <w:rPr>
+          <w:color w:val="333333"/>
+        </w:rPr>
+        <w:t> </w:t>
+      </w:r>
+      <w:r>
+        <w:rPr>
+          <w:color w:val="333333"/>
+        </w:rPr>
+        <w:t>Virtual via Discord</w:t>
+      </w:r>
+    </w:p>
+    <w:p>
+      <w:pPr>
+        <w:pStyle w:val="NormalWeb"/>
+        <w:spacing w:before="0" w:beforeAutospacing="0" w:after="0" w:afterAutospacing="0" w:line="360" w:lineRule="auto"/>
+        <w:rPr>
+          <w:color w:val="333333"/>
+        </w:rPr>
+      </w:pPr>
+      <w:r>
+        <w:rPr>
+          <w:rStyle w:val="Strong"/>
+          <w:rFonts w:eastAsiaTheme="majorEastAsia"/>
+          <w:color w:val="333333"/>
+        </w:rPr>
+        <w:t>Objective:</w:t>
+      </w:r>
+      <w:r>
+        <w:rPr>
+          <w:color w:val="333333"/>
+        </w:rPr>
+        <w:t> </w:t>
+      </w:r>
+      <w:r>
+        <w:rPr>
+          <w:color w:val="333333"/>
+        </w:rPr>
+        <w:t>Plan for the completion of Deliverable 2</w:t>
+      </w:r>
+    </w:p>
+    <w:p>
+      <w:pPr>
+        <w:pStyle w:val="NormalWeb"/>
+        <w:spacing w:before="0" w:beforeAutospacing="0" w:after="0" w:afterAutospacing="0" w:line="360" w:lineRule="auto"/>
+        <w:rPr>
+          <w:color w:val="333333"/>
+        </w:rPr>
+      </w:pPr>
+      <w:r>
+        <w:rPr>
+          <w:rStyle w:val="Strong"/>
+          <w:rFonts w:eastAsiaTheme="majorEastAsia"/>
+          <w:color w:val="333333"/>
+        </w:rPr>
+        <w:t>Team Members Present:</w:t>
+      </w:r>
+      <w:r>
+        <w:rPr>
+          <w:color w:val="333333"/>
+        </w:rPr>
+        <w:t> </w:t>
+      </w:r>
+      <w:r>
+        <w:rPr>
+          <w:color w:val="333333"/>
+        </w:rPr>
+        <w:t>Lauren, Jacob, Hudson, Logan, Collin</w:t>
+      </w:r>
+    </w:p>
+    <w:p>
+      <w:pPr>
+        <w:pStyle w:val="NormalWeb"/>
+        <w:spacing w:before="0" w:beforeAutospacing="0" w:after="0" w:afterAutospacing="0" w:line="360" w:lineRule="auto"/>
+        <w:rPr>
+          <w:color w:val="333333"/>
+        </w:rPr>
+      </w:pPr>
+      <w:r>
+        <w:rPr>
+          <w:color w:val="333333"/>
+        </w:rPr>
+        <w:t>Absent: Quinn</w:t>
+      </w:r>
+    </w:p>
+    <w:p>
+      <w:pPr>
+        <w:pStyle w:val="NormalWeb"/>
+        <w:spacing w:before="0" w:beforeAutospacing="0" w:after="0" w:afterAutospacing="0" w:line="360" w:lineRule="auto"/>
+        <w:rPr>
+          <w:color w:val="333333"/>
+        </w:rPr>
+      </w:pPr>
+    </w:p>
+    <w:p>
+      <w:pPr>
+        <w:pStyle w:val="NormalWeb"/>
+        <w:spacing w:before="180" w:beforeAutospacing="0" w:after="180" w:afterAutospacing="0"/>
+        <w:rPr>
+          <w:b/>
+          <w:bCs/>
+          <w:color w:val="333333"/>
+        </w:rPr>
+      </w:pPr>
+      <w:r>
+        <w:rPr>
+          <w:b/>
+          <w:bCs/>
+          <w:color w:val="333333"/>
+        </w:rPr>
+        <w:t>Organizational tasks Accomplished:</w:t>
+      </w:r>
+    </w:p>
+    <w:p>
+      <w:pPr>
+        <w:pStyle w:val="NormalWeb"/>
+        <w:numPr>
+          <w:ilvl w:val="0"/>
+          <w:numId w:val="5"/>
+        </w:numPr>
+        <w:spacing w:before="180" w:beforeAutospacing="0" w:after="180" w:afterAutospacing="0"/>
+        <w:rPr>
+          <w:b/>
+          <w:bCs/>
+          <w:color w:val="333333"/>
+        </w:rPr>
+      </w:pPr>
+      <w:r>
+        <w:rPr>
+          <w:color w:val="333333"/>
+        </w:rPr>
+        <w:t>Quinn will share a word document with the Requirements Specification Document and Software Architecture document.</w:t>
+      </w:r>
+    </w:p>
+    <w:p>
+      <w:pPr>
+        <w:pStyle w:val="NormalWeb"/>
+        <w:numPr>
+          <w:ilvl w:val="0"/>
+          <w:numId w:val="5"/>
+        </w:numPr>
+        <w:spacing w:before="180" w:beforeAutospacing="0" w:after="180" w:afterAutospacing="0"/>
+        <w:rPr>
+          <w:b/>
+          <w:bCs/>
+          <w:color w:val="333333"/>
+        </w:rPr>
+      </w:pPr>
+      <w:r>
+        <w:rPr>
+          <w:color w:val="333333"/>
+        </w:rPr>
+        <w:t>Complete Deliverable 2 by Friday the 13</w:t>
+      </w:r>
+      <w:r>
+        <w:rPr>
+          <w:color w:val="333333"/>
+          <w:vertAlign w:val="superscript"/>
+        </w:rPr>
+        <w:t>th</w:t>
+      </w:r>
+      <w:r>
+        <w:rPr>
+          <w:color w:val="333333"/>
+        </w:rPr>
+        <w:t xml:space="preserve"> (including the check over and submission).</w:t>
+      </w:r>
+    </w:p>
+    <w:p>
+      <w:pPr>
+        <w:pStyle w:val="NormalWeb"/>
+        <w:numPr>
+          <w:ilvl w:val="0"/>
+          <w:numId w:val="5"/>
+        </w:numPr>
+        <w:spacing w:before="180" w:beforeAutospacing="0" w:after="180" w:afterAutospacing="0"/>
+        <w:rPr>
+          <w:b/>
+          <w:bCs/>
+          <w:color w:val="333333"/>
+        </w:rPr>
+      </w:pPr>
+      <w:r>
+        <w:rPr>
+          <w:color w:val="333333"/>
+        </w:rPr>
+        <w:t>Try and meet before Friday 13</w:t>
+      </w:r>
+      <w:r>
+        <w:rPr>
+          <w:color w:val="333333"/>
+          <w:vertAlign w:val="superscript"/>
+        </w:rPr>
+        <w:t>th</w:t>
+      </w:r>
+      <w:r>
+        <w:rPr>
+          <w:color w:val="333333"/>
+        </w:rPr>
+        <w:t xml:space="preserve"> for next deliverable.</w:t>
+      </w:r>
+    </w:p>
+    <w:p>
+      <w:pPr>
+        <w:pStyle w:val="NormalWeb"/>
+        <w:numPr>
+          <w:ilvl w:val="0"/>
+          <w:numId w:val="5"/>
+        </w:numPr>
+        <w:spacing w:before="180" w:beforeAutospacing="0" w:after="180" w:afterAutospacing="0"/>
+        <w:rPr>
+          <w:b/>
+          <w:bCs/>
+          <w:color w:val="333333"/>
+        </w:rPr>
+      </w:pPr>
+      <w:r>
+        <w:rPr>
+          <w:color w:val="333333"/>
+        </w:rPr>
+        <w:t>Discussed and looked over deliverable 3.</w:t>
+      </w:r>
+    </w:p>
+    <w:p>
+      <w:pPr>
+        <w:pStyle w:val="NormalWeb"/>
+        <w:numPr>
+          <w:ilvl w:val="0"/>
+          <w:numId w:val="5"/>
+        </w:numPr>
+        <w:spacing w:before="180" w:beforeAutospacing="0" w:after="180" w:afterAutospacing="0"/>
+        <w:rPr>
+          <w:b/>
+          <w:bCs/>
+          <w:color w:val="333333"/>
+        </w:rPr>
+      </w:pPr>
+      <w:r>
+        <w:rPr>
+          <w:color w:val="333333"/>
+        </w:rPr>
+        <w:t>May continue meeting this time in the future--seems to work for everyone, or after class sometimes.</w:t>
+      </w:r>
+    </w:p>
+    <w:p>
+      <w:pPr>
+        <w:pStyle w:val="NormalWeb"/>
+        <w:numPr>
+          <w:ilvl w:val="0"/>
+          <w:numId w:val="5"/>
+        </w:numPr>
+        <w:spacing w:before="180" w:beforeAutospacing="0" w:after="180" w:afterAutospacing="0"/>
+        <w:rPr>
+          <w:b/>
+          <w:bCs/>
+          <w:color w:val="333333"/>
+        </w:rPr>
+      </w:pPr>
+      <w:r>
+        <w:rPr>
+          <w:color w:val="333333"/>
+        </w:rPr>
+        <w:t>Assigned sections for SRS completion (below).</w:t>
+      </w:r>
+    </w:p>
+    <w:p>
+      <w:pPr>
+        <w:pStyle w:val="NormalWeb"/>
+        <w:spacing w:before="180" w:beforeAutospacing="0" w:after="180" w:afterAutospacing="0"/>
+        <w:ind w:left="720"/>
+        <w:rPr>
+          <w:b/>
+          <w:bCs/>
+          <w:color w:val="333333"/>
+        </w:rPr>
+      </w:pPr>
+    </w:p>
+    <w:p>
+      <w:pPr>
+        <w:pStyle w:val="NormalWeb"/>
+        <w:spacing w:before="180" w:beforeAutospacing="0" w:after="180" w:afterAutospacing="0"/>
+        <w:rPr>
+          <w:color w:val="333333"/>
+        </w:rPr>
+      </w:pPr>
+      <w:r>
+        <w:rPr>
+          <w:rStyle w:val="Strong"/>
+          <w:rFonts w:eastAsiaTheme="majorEastAsia"/>
+          <w:color w:val="333333"/>
+        </w:rPr>
+        <w:t>Tasks Allocated:</w:t>
+      </w:r>
+    </w:p>
+    <w:p>
+      <w:pPr>
+        <w:pStyle w:val="NormalWeb"/>
+        <w:numPr>
+          <w:ilvl w:val="0"/>
+          <w:numId w:val="3"/>
+        </w:numPr>
+        <w:spacing w:before="180" w:beforeAutospacing="0" w:after="180" w:afterAutospacing="0"/>
+        <w:ind w:left="1095"/>
+        <w:rPr>
+          <w:color w:val="333333"/>
+        </w:rPr>
+      </w:pPr>
+      <w:r>
+        <w:rPr>
+          <w:rStyle w:val="Strong"/>
+          <w:rFonts w:eastAsiaTheme="majorEastAsia"/>
+          <w:color w:val="333333"/>
+        </w:rPr>
+        <w:t>Logan</w:t>
+      </w:r>
+      <w:r>
+        <w:rPr>
+          <w:rStyle w:val="Strong"/>
+          <w:rFonts w:eastAsiaTheme="majorEastAsia"/>
+          <w:color w:val="333333"/>
+        </w:rPr>
+        <w:t>:</w:t>
+      </w:r>
+      <w:r>
+        <w:rPr>
+          <w:color w:val="333333"/>
+        </w:rPr>
+        <w:t> </w:t>
+      </w:r>
+      <w:r>
+        <w:rPr>
+          <w:color w:val="333333"/>
+        </w:rPr>
+        <w:t>Complete Intro Section of SRS by Friday the 13</w:t>
+      </w:r>
+      <w:r>
+        <w:rPr>
+          <w:color w:val="333333"/>
+          <w:vertAlign w:val="superscript"/>
+        </w:rPr>
+        <w:t>th</w:t>
+      </w:r>
+      <w:r>
+        <w:rPr>
+          <w:color w:val="333333"/>
+        </w:rPr>
+        <w:t>.</w:t>
+      </w:r>
+    </w:p>
+    <w:p>
+      <w:pPr>
+        <w:pStyle w:val="NormalWeb"/>
+        <w:numPr>
+          <w:ilvl w:val="0"/>
+          <w:numId w:val="3"/>
+        </w:numPr>
+        <w:spacing w:before="180" w:beforeAutospacing="0" w:after="180" w:afterAutospacing="0"/>
+        <w:ind w:left="1095"/>
+        <w:rPr>
+          <w:color w:val="333333"/>
+        </w:rPr>
+      </w:pPr>
+      <w:r>
+        <w:rPr>
+          <w:rStyle w:val="Strong"/>
+          <w:rFonts w:eastAsiaTheme="majorEastAsia"/>
+          <w:color w:val="333333"/>
+        </w:rPr>
+        <w:t>Quinn</w:t>
+      </w:r>
+      <w:r>
+        <w:rPr>
+          <w:rStyle w:val="Strong"/>
+          <w:rFonts w:eastAsiaTheme="majorEastAsia"/>
+          <w:color w:val="333333"/>
+        </w:rPr>
+        <w:t>:</w:t>
+      </w:r>
+      <w:r>
+        <w:rPr>
+          <w:color w:val="333333"/>
+        </w:rPr>
+        <w:t> </w:t>
+      </w:r>
+      <w:r>
+        <w:rPr>
+          <w:color w:val="333333"/>
+        </w:rPr>
+        <w:t xml:space="preserve"> Share SRS word document for deliverable 2.</w:t>
+      </w:r>
+    </w:p>
+    <w:p>
+      <w:pPr>
+        <w:pStyle w:val="NormalWeb"/>
+        <w:numPr>
+          <w:ilvl w:val="0"/>
+          <w:numId w:val="3"/>
+        </w:numPr>
+        <w:spacing w:before="180" w:beforeAutospacing="0" w:after="180" w:afterAutospacing="0"/>
+        <w:ind w:left="1095"/>
+        <w:rPr>
+          <w:color w:val="333333"/>
+        </w:rPr>
+      </w:pPr>
+      <w:r>
+        <w:rPr>
+          <w:rStyle w:val="Strong"/>
+          <w:rFonts w:eastAsiaTheme="majorEastAsia"/>
+          <w:color w:val="333333"/>
+        </w:rPr>
+        <w:t>Hudson</w:t>
+      </w:r>
+      <w:r>
+        <w:rPr>
+          <w:rStyle w:val="Strong"/>
+          <w:rFonts w:eastAsiaTheme="majorEastAsia"/>
+          <w:color w:val="333333"/>
+        </w:rPr>
+        <w:t>:</w:t>
+      </w:r>
+      <w:r>
+        <w:rPr>
+          <w:color w:val="333333"/>
+        </w:rPr>
+        <w:t> </w:t>
+      </w:r>
+      <w:r>
+        <w:rPr>
+          <w:color w:val="333333"/>
+        </w:rPr>
+        <w:t>Complete Section 2 of SRS by Friday the 13</w:t>
+      </w:r>
+      <w:r>
+        <w:rPr>
+          <w:color w:val="333333"/>
+          <w:vertAlign w:val="superscript"/>
+        </w:rPr>
+        <w:t>th</w:t>
+      </w:r>
+      <w:r>
+        <w:rPr>
+          <w:color w:val="333333"/>
+        </w:rPr>
+        <w:t>.</w:t>
+      </w:r>
+    </w:p>
+    <w:p>
+      <w:pPr>
+        <w:pStyle w:val="NormalWeb"/>
+        <w:numPr>
+          <w:ilvl w:val="0"/>
+          <w:numId w:val="3"/>
+        </w:numPr>
+        <w:spacing w:before="180" w:beforeAutospacing="0" w:after="180" w:afterAutospacing="0"/>
+        <w:ind w:left="1095"/>
+        <w:rPr>
+          <w:color w:val="333333"/>
+        </w:rPr>
+      </w:pPr>
+      <w:r>
+        <w:rPr>
+          <w:rStyle w:val="Strong"/>
+          <w:rFonts w:eastAsiaTheme="majorEastAsia"/>
+          <w:color w:val="333333"/>
+        </w:rPr>
+        <w:t>Lauren</w:t>
+      </w:r>
+      <w:r>
+        <w:rPr>
+          <w:rStyle w:val="Strong"/>
+          <w:rFonts w:eastAsiaTheme="majorEastAsia"/>
+          <w:color w:val="333333"/>
+        </w:rPr>
+        <w:t>:</w:t>
+      </w:r>
+      <w:r>
+        <w:rPr>
+          <w:color w:val="333333"/>
+        </w:rPr>
+        <w:t> </w:t>
+      </w:r>
+      <w:r>
+        <w:rPr>
+          <w:color w:val="333333"/>
+        </w:rPr>
+        <w:t>Complete current meeting log.</w:t>
+      </w:r>
+    </w:p>
+    <w:p>
+      <w:pPr>
+        <w:pStyle w:val="NormalWeb"/>
+        <w:numPr>
+          <w:ilvl w:val="0"/>
+          <w:numId w:val="3"/>
+        </w:numPr>
+        <w:spacing w:before="180" w:beforeAutospacing="0" w:after="180" w:afterAutospacing="0"/>
+        <w:ind w:left="1095"/>
+        <w:rPr>
+          <w:color w:val="333333"/>
+        </w:rPr>
+      </w:pPr>
+      <w:r>
+        <w:rPr>
+          <w:rStyle w:val="Strong"/>
+          <w:rFonts w:eastAsiaTheme="majorEastAsia"/>
+          <w:color w:val="333333"/>
+        </w:rPr>
+        <w:t>Collin</w:t>
+      </w:r>
+      <w:r>
+        <w:rPr>
+          <w:rStyle w:val="Strong"/>
+          <w:rFonts w:eastAsiaTheme="majorEastAsia"/>
+          <w:color w:val="333333"/>
+        </w:rPr>
+        <w:t>:</w:t>
+      </w:r>
+      <w:r>
+        <w:rPr>
+          <w:color w:val="333333"/>
+        </w:rPr>
+        <w:t> </w:t>
+      </w:r>
+      <w:r>
+        <w:rPr>
+          <w:color w:val="333333"/>
+        </w:rPr>
+        <w:t xml:space="preserve"> N/A</w:t>
+      </w:r>
+    </w:p>
+    <w:p>
+      <w:pPr>
+        <w:pStyle w:val="NormalWeb"/>
+        <w:numPr>
+          <w:ilvl w:val="0"/>
+          <w:numId w:val="3"/>
+        </w:numPr>
+        <w:spacing w:before="180" w:beforeAutospacing="0" w:after="180" w:afterAutospacing="0"/>
+        <w:ind w:left="1095"/>
+        <w:rPr>
+          <w:color w:val="333333"/>
+        </w:rPr>
+      </w:pPr>
+      <w:r>
+        <w:rPr>
+          <w:rStyle w:val="Strong"/>
+          <w:rFonts w:eastAsiaTheme="majorEastAsia"/>
+          <w:color w:val="333333"/>
+        </w:rPr>
+        <w:t>Jacob:</w:t>
+      </w:r>
+      <w:r>
+        <w:rPr>
+          <w:color w:val="333333"/>
+        </w:rPr>
+        <w:t xml:space="preserve"> </w:t>
+      </w:r>
+      <w:r>
+        <w:rPr>
+          <w:color w:val="333333"/>
+        </w:rPr>
+        <w:t>Complete Section 3-5 of SRS by Friday the 13</w:t>
+      </w:r>
+      <w:r>
+        <w:rPr>
+          <w:color w:val="333333"/>
+          <w:vertAlign w:val="superscript"/>
+        </w:rPr>
+        <w:t>th</w:t>
+      </w:r>
+      <w:r>
+        <w:rPr>
+          <w:color w:val="333333"/>
+        </w:rPr>
+        <w:t>.</w:t>
+      </w:r>
+    </w:p>
+    <w:p>
+      <w:pPr>
+        <w:pStyle w:val="NormalWeb"/>
+        <w:spacing w:before="180" w:beforeAutospacing="0" w:after="180" w:afterAutospacing="0"/>
+        <w:rPr>
+          <w:color w:val="333333"/>
+        </w:rPr>
+      </w:pPr>
     </w:p>
     <w:sectPr>
       <w:pgSz w:w="12240" w:h="15840"/>
@@ -1763,6 +2477,119 @@
       </w:rPr>
     </w:lvl>
   </w:abstractNum>
+  <w:abstractNum w:abstractNumId="4" w15:restartNumberingAfterBreak="0">
+    <w:nsid w:val="7F036744"/>
+    <w:multiLevelType w:val="hybridMultilevel"/>
+    <w:tmpl w:val="BF128FB4"/>
+    <w:lvl w:ilvl="0" w:tplc="04090001">
+      <w:start w:val="1"/>
+      <w:numFmt w:val="bullet"/>
+      <w:lvlText w:val=""/>
+      <w:lvlJc w:val="left"/>
+      <w:pPr>
+        <w:ind w:left="720" w:hanging="360"/>
+      </w:pPr>
+      <w:rPr>
+        <w:rFonts w:ascii="Symbol" w:hAnsi="Symbol" w:hint="default"/>
+      </w:rPr>
+    </w:lvl>
+    <w:lvl w:ilvl="1" w:tplc="04090003" w:tentative="1">
+      <w:start w:val="1"/>
+      <w:numFmt w:val="bullet"/>
+      <w:lvlText w:val="o"/>
+      <w:lvlJc w:val="left"/>
+      <w:pPr>
+        <w:ind w:left="1440" w:hanging="360"/>
+      </w:pPr>
+      <w:rPr>
+        <w:rFonts w:ascii="Courier New" w:hAnsi="Courier New" w:cs="Courier New" w:hint="default"/>
+      </w:rPr>
+    </w:lvl>
+    <w:lvl w:ilvl="2" w:tplc="04090005" w:tentative="1">
+      <w:start w:val="1"/>
+      <w:numFmt w:val="bullet"/>
+      <w:lvlText w:val=""/>
+      <w:lvlJc w:val="left"/>
+      <w:pPr>
+        <w:ind w:left="2160" w:hanging="360"/>
+      </w:pPr>
+      <w:rPr>
+        <w:rFonts w:ascii="Wingdings" w:hAnsi="Wingdings" w:hint="default"/>
+      </w:rPr>
+    </w:lvl>
+    <w:lvl w:ilvl="3" w:tplc="04090001" w:tentative="1">
+      <w:start w:val="1"/>
+      <w:numFmt w:val="bullet"/>
+      <w:lvlText w:val=""/>
+      <w:lvlJc w:val="left"/>
+      <w:pPr>
+        <w:ind w:left="2880" w:hanging="360"/>
+      </w:pPr>
+      <w:rPr>
+        <w:rFonts w:ascii="Symbol" w:hAnsi="Symbol" w:hint="default"/>
+      </w:rPr>
+    </w:lvl>
+    <w:lvl w:ilvl="4" w:tplc="04090003" w:tentative="1">
+      <w:start w:val="1"/>
+      <w:numFmt w:val="bullet"/>
+      <w:lvlText w:val="o"/>
+      <w:lvlJc w:val="left"/>
+      <w:pPr>
+        <w:ind w:left="3600" w:hanging="360"/>
+      </w:pPr>
+      <w:rPr>
+        <w:rFonts w:ascii="Courier New" w:hAnsi="Courier New" w:cs="Courier New" w:hint="default"/>
+      </w:rPr>
+    </w:lvl>
+    <w:lvl w:ilvl="5" w:tplc="04090005" w:tentative="1">
+      <w:start w:val="1"/>
+      <w:numFmt w:val="bullet"/>
+      <w:lvlText w:val=""/>
+      <w:lvlJc w:val="left"/>
+      <w:pPr>
+        <w:ind w:left="4320" w:hanging="360"/>
+      </w:pPr>
+      <w:rPr>
+        <w:rFonts w:ascii="Wingdings" w:hAnsi="Wingdings" w:hint="default"/>
+      </w:rPr>
+    </w:lvl>
+    <w:lvl w:ilvl="6" w:tplc="04090001" w:tentative="1">
+      <w:start w:val="1"/>
+      <w:numFmt w:val="bullet"/>
+      <w:lvlText w:val=""/>
+      <w:lvlJc w:val="left"/>
+      <w:pPr>
+        <w:ind w:left="5040" w:hanging="360"/>
+      </w:pPr>
+      <w:rPr>
+        <w:rFonts w:ascii="Symbol" w:hAnsi="Symbol" w:hint="default"/>
+      </w:rPr>
+    </w:lvl>
+    <w:lvl w:ilvl="7" w:tplc="04090003" w:tentative="1">
+      <w:start w:val="1"/>
+      <w:numFmt w:val="bullet"/>
+      <w:lvlText w:val="o"/>
+      <w:lvlJc w:val="left"/>
+      <w:pPr>
+        <w:ind w:left="5760" w:hanging="360"/>
+      </w:pPr>
+      <w:rPr>
+        <w:rFonts w:ascii="Courier New" w:hAnsi="Courier New" w:cs="Courier New" w:hint="default"/>
+      </w:rPr>
+    </w:lvl>
+    <w:lvl w:ilvl="8" w:tplc="04090005" w:tentative="1">
+      <w:start w:val="1"/>
+      <w:numFmt w:val="bullet"/>
+      <w:lvlText w:val=""/>
+      <w:lvlJc w:val="left"/>
+      <w:pPr>
+        <w:ind w:left="6480" w:hanging="360"/>
+      </w:pPr>
+      <w:rPr>
+        <w:rFonts w:ascii="Wingdings" w:hAnsi="Wingdings" w:hint="default"/>
+      </w:rPr>
+    </w:lvl>
+  </w:abstractNum>
   <w:num w:numId="1" w16cid:durableId="1140414189">
     <w:abstractNumId w:val="3"/>
   </w:num>
@@ -1774,6 +2601,9 @@
   </w:num>
   <w:num w:numId="4" w16cid:durableId="417213585">
     <w:abstractNumId w:val="2"/>
+  </w:num>
+  <w:num w:numId="5" w16cid:durableId="1365671453">
+    <w:abstractNumId w:val="4"/>
   </w:num>
 </w:numbering>
 </file>

</xml_diff>